<commit_message>
Distinguish titoletti (14pt left) from ritual headings (16pt centered)
Client rule: titoletti (Fatto, Diritto, MOTIVA, CHIEDE ALTRESÌ, numbered
topics) are always 14pt left with content on the next line; OGGETTO label
and ritual headings (IN FATTO, DICHIARA, ...) are 16pt (ritual centered).

- Add disposition(verb, content) helper: a 14pt-left titoletto + its content
  a capo, for dispositive verbs that would otherwise bundle text inline.
- Flatten nested block lists in body emission and validation.
- Re-render the ritiro marchio letter through the tool (CHIEDE ALTRESÌ now a
  titoletto, no inline-bold paragraph); add an istanza example to the
  validation harness (5 representative letters).
- Document that letters.py is the source of truth; ad-hoc script changes are
  allowed only when needed, preserving law-firm decorum.

Co-Authored-By: Claude Opus 4.8 (1M context) <noreply@anthropic.com>
</commit_message>
<xml_diff>
--- a/documenti_generati/ritiro_marchio_alfa_orbit.docx
+++ b/documenti_generati/ritiro_marchio_alfa_orbit.docx
@@ -263,18 +263,25 @@
     </w:p>
     <w:p>
       <w:pPr>
-        <w:spacing w:after="120"/>
-        <w:jc w:val="both"/>
+        <w:keepNext/>
+        <w:spacing w:before="240" w:after="120"/>
+        <w:jc w:val="left"/>
       </w:pPr>
       <w:r>
         <w:rPr>
           <w:rFonts w:ascii="Times New Roman" w:hAnsi="Times New Roman" w:cs="Times New Roman"/>
           <w:b/>
           <w:i w:val="0"/>
-          <w:sz w:val="24"/>
+          <w:sz w:val="28"/>
         </w:rPr>
         <w:t>CHIEDE ALTRESÌ</w:t>
       </w:r>
+    </w:p>
+    <w:p>
+      <w:pPr>
+        <w:spacing w:after="120"/>
+        <w:jc w:val="both"/>
+      </w:pPr>
       <w:r>
         <w:rPr>
           <w:rFonts w:ascii="Times New Roman" w:hAnsi="Times New Roman" w:cs="Times New Roman"/>
@@ -282,7 +289,7 @@
           <w:i w:val="0"/>
           <w:sz w:val="24"/>
         </w:rPr>
-        <w:t>, ai sensi dell'art. 229 CPI e dell'art. 91 del D.P.R. 8 dicembre 2016, n. 246, il rimborso delle tasse versate in occasione del deposito, ove rimborsabili, relative al Codice IUV: V2_UIBM_IUV_20260128457, ad eccezione della tassa di domanda non rimborsabile, con accredito sul conto corrente/IBAN che si indicherà su richiesta dell'Ufficio.</w:t>
+        <w:t>ai sensi dell'art. 229 CPI e dell'art. 91 del D.P.R. 8 dicembre 2016, n. 246, il rimborso delle tasse versate in occasione del deposito, ove rimborsabili, relative al Codice IUV: V2_UIBM_IUV_20260128457, ad eccezione della tassa di domanda non rimborsabile, con accredito sul conto corrente/IBAN che si indicherà su richiesta dell'Ufficio.</w:t>
       </w:r>
     </w:p>
     <w:p>

</xml_diff>

<commit_message>
Always emit a date slot; placeholder + review when missing
_emit_date now always writes the date; when date_place is absent the script
fills it with DATE_PLACEHOLDER ("[INSERISCI QUI LA DATA]") and collect_warnings
flags the omission (needs_review). Re-rendered the ritiro marchio letter
through the tool (now shows the date placeholder + needs_review). Updated both
spec docs.

OGGETTO confirmed unchanged: feedback.md (027) explicitly requires
"oggetto: testo" inline justified (label 16pt), not centered — current default.

Co-Authored-By: Claude Opus 4.8 (1M context) <noreply@anthropic.com>
</commit_message>
<xml_diff>
--- a/documenti_generati/ritiro_marchio_alfa_orbit.docx
+++ b/documenti_generati/ritiro_marchio_alfa_orbit.docx
@@ -2,6 +2,21 @@
 <file path=word/document.xml><?xml version="1.0" encoding="utf-8"?>
 <w:document xmlns:wpc="http://schemas.microsoft.com/office/word/2010/wordprocessingCanvas" xmlns:cx="http://schemas.microsoft.com/office/drawing/2014/chartex" xmlns:cx1="http://schemas.microsoft.com/office/drawing/2015/9/8/chartex" xmlns:cx2="http://schemas.microsoft.com/office/drawing/2015/10/21/chartex" xmlns:cx3="http://schemas.microsoft.com/office/drawing/2016/5/9/chartex" xmlns:cx4="http://schemas.microsoft.com/office/drawing/2016/5/10/chartex" xmlns:cx5="http://schemas.microsoft.com/office/drawing/2016/5/11/chartex" xmlns:cx6="http://schemas.microsoft.com/office/drawing/2016/5/12/chartex" xmlns:cx7="http://schemas.microsoft.com/office/drawing/2016/5/13/chartex" xmlns:cx8="http://schemas.microsoft.com/office/drawing/2016/5/14/chartex" xmlns:mc="http://schemas.openxmlformats.org/markup-compatibility/2006" xmlns:aink="http://schemas.microsoft.com/office/drawing/2016/ink" xmlns:am3d="http://schemas.microsoft.com/office/drawing/2017/model3d" xmlns:o="urn:schemas-microsoft-com:office:office" xmlns:oel="http://schemas.microsoft.com/office/2019/extlst" xmlns:r="http://schemas.openxmlformats.org/officeDocument/2006/relationships" xmlns:m="http://schemas.openxmlformats.org/officeDocument/2006/math" xmlns:v="urn:schemas-microsoft-com:vml" xmlns:wp14="http://schemas.microsoft.com/office/word/2010/wordprocessingDrawing" xmlns:wp="http://schemas.openxmlformats.org/drawingml/2006/wordprocessingDrawing" xmlns:w10="urn:schemas-microsoft-com:office:word" xmlns:w="http://schemas.openxmlformats.org/wordprocessingml/2006/main" xmlns:w14="http://schemas.microsoft.com/office/word/2010/wordml" xmlns:w15="http://schemas.microsoft.com/office/word/2012/wordml" xmlns:w16cex="http://schemas.microsoft.com/office/word/2018/wordml/cex" xmlns:w16cid="http://schemas.microsoft.com/office/word/2016/wordml/cid" xmlns:w16="http://schemas.microsoft.com/office/word/2018/wordml" xmlns:w16du="http://schemas.microsoft.com/office/word/2023/wordml/word16du" xmlns:w16sdtdh="http://schemas.microsoft.com/office/word/2020/wordml/sdtdatahash" xmlns:w16sdtfl="http://schemas.microsoft.com/office/word/2024/wordml/sdtformatlock" xmlns:w16se="http://schemas.microsoft.com/office/word/2015/wordml/symex" xmlns:wpg="http://schemas.microsoft.com/office/word/2010/wordprocessingGroup" xmlns:wpi="http://schemas.microsoft.com/office/word/2010/wordprocessingInk" xmlns:wne="http://schemas.microsoft.com/office/word/2006/wordml" xmlns:wps="http://schemas.microsoft.com/office/word/2010/wordprocessingShape" mc:Ignorable="w14 w15 w16se w16cid w16 w16cex w16sdtdh w16sdtfl w16du wp14">
   <w:body>
+    <w:p>
+      <w:pPr>
+        <w:spacing w:before="120" w:after="200"/>
+        <w:jc w:val="right"/>
+      </w:pPr>
+      <w:r>
+        <w:rPr>
+          <w:rFonts w:ascii="Times New Roman" w:hAnsi="Times New Roman" w:cs="Times New Roman"/>
+          <w:b w:val="0"/>
+          <w:i w:val="0"/>
+          <w:sz w:val="24"/>
+        </w:rPr>
+        <w:t>[INSERISCI QUI LA DATA]</w:t>
+      </w:r>
+    </w:p>
     <w:p>
       <w:pPr>
         <w:spacing w:after="40"/>

</xml_diff>

<commit_message>
OGGETTO default -> split: centered label + justified content
Per client clarification of feedback 027: the "OGGETTO:" label is a CENTERED
16pt bold heading; the subject text goes on the next line (a capo),
LEFT/JUSTIFIED 12pt bold (the 027 complaint was the content being centered,
not justified). New defaults: subject_style=SPLIT, subject_label_center=True,
subject_content_center=False. Standardizes all families; the 4 historical
inline letters are unified to split. Re-rendered the ritiro marchio letter.
Spec docs and dubbi_formattazione.md updated (D1/D2/D3 resolved).

Co-Authored-By: Claude Opus 4.8 (1M context) <noreply@anthropic.com>
</commit_message>
<xml_diff>
--- a/documenti_generati/ritiro_marchio_alfa_orbit.docx
+++ b/documenti_generati/ritiro_marchio_alfa_orbit.docx
@@ -2,21 +2,6 @@
 <file path=word/document.xml><?xml version="1.0" encoding="utf-8"?>
 <w:document xmlns:wpc="http://schemas.microsoft.com/office/word/2010/wordprocessingCanvas" xmlns:cx="http://schemas.microsoft.com/office/drawing/2014/chartex" xmlns:cx1="http://schemas.microsoft.com/office/drawing/2015/9/8/chartex" xmlns:cx2="http://schemas.microsoft.com/office/drawing/2015/10/21/chartex" xmlns:cx3="http://schemas.microsoft.com/office/drawing/2016/5/9/chartex" xmlns:cx4="http://schemas.microsoft.com/office/drawing/2016/5/10/chartex" xmlns:cx5="http://schemas.microsoft.com/office/drawing/2016/5/11/chartex" xmlns:cx6="http://schemas.microsoft.com/office/drawing/2016/5/12/chartex" xmlns:cx7="http://schemas.microsoft.com/office/drawing/2016/5/13/chartex" xmlns:cx8="http://schemas.microsoft.com/office/drawing/2016/5/14/chartex" xmlns:mc="http://schemas.openxmlformats.org/markup-compatibility/2006" xmlns:aink="http://schemas.microsoft.com/office/drawing/2016/ink" xmlns:am3d="http://schemas.microsoft.com/office/drawing/2017/model3d" xmlns:o="urn:schemas-microsoft-com:office:office" xmlns:oel="http://schemas.microsoft.com/office/2019/extlst" xmlns:r="http://schemas.openxmlformats.org/officeDocument/2006/relationships" xmlns:m="http://schemas.openxmlformats.org/officeDocument/2006/math" xmlns:v="urn:schemas-microsoft-com:vml" xmlns:wp14="http://schemas.microsoft.com/office/word/2010/wordprocessingDrawing" xmlns:wp="http://schemas.openxmlformats.org/drawingml/2006/wordprocessingDrawing" xmlns:w10="urn:schemas-microsoft-com:office:word" xmlns:w="http://schemas.openxmlformats.org/wordprocessingml/2006/main" xmlns:w14="http://schemas.microsoft.com/office/word/2010/wordml" xmlns:w15="http://schemas.microsoft.com/office/word/2012/wordml" xmlns:w16cex="http://schemas.microsoft.com/office/word/2018/wordml/cex" xmlns:w16cid="http://schemas.microsoft.com/office/word/2016/wordml/cid" xmlns:w16="http://schemas.microsoft.com/office/word/2018/wordml" xmlns:w16du="http://schemas.microsoft.com/office/word/2023/wordml/word16du" xmlns:w16sdtdh="http://schemas.microsoft.com/office/word/2020/wordml/sdtdatahash" xmlns:w16sdtfl="http://schemas.microsoft.com/office/word/2024/wordml/sdtformatlock" xmlns:w16se="http://schemas.microsoft.com/office/word/2015/wordml/symex" xmlns:wpg="http://schemas.microsoft.com/office/word/2010/wordprocessingGroup" xmlns:wpi="http://schemas.microsoft.com/office/word/2010/wordprocessingInk" xmlns:wne="http://schemas.microsoft.com/office/word/2006/wordml" xmlns:wps="http://schemas.microsoft.com/office/word/2010/wordprocessingShape" mc:Ignorable="w14 w15 w16se w16cid w16 w16cex w16sdtdh w16sdtfl w16du wp14">
   <w:body>
-    <w:p>
-      <w:pPr>
-        <w:spacing w:before="120" w:after="200"/>
-        <w:jc w:val="right"/>
-      </w:pPr>
-      <w:r>
-        <w:rPr>
-          <w:rFonts w:ascii="Times New Roman" w:hAnsi="Times New Roman" w:cs="Times New Roman"/>
-          <w:b w:val="0"/>
-          <w:i w:val="0"/>
-          <w:sz w:val="24"/>
-        </w:rPr>
-        <w:t>[INSERISCI QUI LA DATA]</w:t>
-      </w:r>
-    </w:p>
     <w:p>
       <w:pPr>
         <w:spacing w:after="40"/>
@@ -147,8 +132,9 @@
     </w:p>
     <w:p>
       <w:pPr>
-        <w:spacing w:before="160" w:after="160"/>
-        <w:jc w:val="both"/>
+        <w:keepNext/>
+        <w:spacing w:before="200" w:after="80"/>
+        <w:jc w:val="center"/>
       </w:pPr>
       <w:r>
         <w:rPr>
@@ -159,6 +145,12 @@
         </w:rPr>
         <w:t>OGGETTO:</w:t>
       </w:r>
+    </w:p>
+    <w:p>
+      <w:pPr>
+        <w:spacing w:after="160"/>
+        <w:jc w:val="both"/>
+      </w:pPr>
       <w:r>
         <w:rPr>
           <w:rFonts w:ascii="Times New Roman" w:hAnsi="Times New Roman" w:cs="Times New Roman"/>
@@ -166,7 +158,7 @@
           <w:i w:val="0"/>
           <w:sz w:val="24"/>
         </w:rPr>
-        <w:t xml:space="preserve"> Ritiro della domanda di registrazione di marchio d'impresa n. 302026000045219 - ai sensi dell'art. 172, comma 1, D.Lgs. 10 febbraio 2005, n. 30 - Codice della Proprietà Industriale</w:t>
+        <w:t>Ritiro della domanda di registrazione di marchio d'impresa n. 302026000045219 - ai sensi dell'art. 172, comma 1, D.Lgs. 10 febbraio 2005, n. 30 - Codice della Proprietà Industriale</w:t>
       </w:r>
     </w:p>
     <w:p>
@@ -324,7 +316,7 @@
     </w:p>
     <w:p>
       <w:pPr>
-        <w:spacing w:before="160" w:after="40"/>
+        <w:spacing w:before="360" w:after="40"/>
         <w:jc w:val="right"/>
       </w:pPr>
       <w:r>
@@ -339,7 +331,7 @@
     </w:p>
     <w:p>
       <w:pPr>
-        <w:spacing w:before="80" w:after="40"/>
+        <w:spacing w:before="40" w:after="40"/>
         <w:jc w:val="right"/>
       </w:pPr>
       <w:r>

</xml_diff>